<commit_message>
docs(thesis): enforce strict bolding on headings only, remove Sistematika Penulisan, place bibliography after Bab 3, and update Bab 3 hardware components and 2026/2027 timeline
</commit_message>
<xml_diff>
--- a/Thesis/docx_export/BAGIAN_AWAL_PROPOSAL.docx
+++ b/Thesis/docx_export/BAGIAN_AWAL_PROPOSAL.docx
@@ -2151,30 +2151,6 @@
         <w:tabs>
           <w:tab w:pos="7427" w:val="right" w:leader="dot"/>
         </w:tabs>
-        <w:spacing w:line="276" w:lineRule="auto" w:after="40"/>
-        <w:ind w:left="283"/>
-      </w:pPr>
-      <w:r>
-        <w:rPr>
-          <w:rFonts w:ascii="Arial" w:hAnsi="Arial"/>
-          <w:sz w:val="19"/>
-        </w:rPr>
-        <w:t>1.6 Sistematika Penulisan</w:t>
-      </w:r>
-      <w:r>
-        <w:rPr>
-          <w:rFonts w:ascii="Arial" w:hAnsi="Arial"/>
-          <w:sz w:val="19"/>
-        </w:rPr>
-        <w:tab/>
-        <w:t>8</w:t>
-      </w:r>
-    </w:p>
-    <w:p>
-      <w:pPr>
-        <w:tabs>
-          <w:tab w:pos="7427" w:val="right" w:leader="dot"/>
-        </w:tabs>
         <w:spacing w:line="276" w:lineRule="auto" w:after="80"/>
       </w:pPr>
       <w:r>
@@ -2682,7 +2658,7 @@
           <w:rFonts w:ascii="Arial" w:hAnsi="Arial"/>
           <w:sz w:val="19"/>
         </w:rPr>
-        <w:t>Tabel 2.3  Parameter Redaman Linier dan Non-Linier BlueROV2 Heavy</w:t>
+        <w:t>Tabel 2.3  Parameter Redaman Linier dan Non-Linier Wahana Over-Actuated</w:t>
       </w:r>
       <w:r>
         <w:rPr>
@@ -2705,7 +2681,7 @@
           <w:rFonts w:ascii="Arial" w:hAnsi="Arial"/>
           <w:sz w:val="19"/>
         </w:rPr>
-        <w:t>Tabel 2.4  Posisi dan Sudut Pemasangan 8 Motor Pendorong T200 pada Rangka Wahana</w:t>
+        <w:t>Tabel 2.4  Posisi dan Sudut Pemasangan 8 Motor Pendorong BLDC pada Rangka Wahana</w:t>
       </w:r>
       <w:r>
         <w:rPr>
@@ -2728,7 +2704,7 @@
           <w:rFonts w:ascii="Arial" w:hAnsi="Arial"/>
           <w:sz w:val="19"/>
         </w:rPr>
-        <w:t>Tabel 3.1  Jadwal dan Rencana Waktu Pelaksanaan Tahapan Penelitian</w:t>
+        <w:t>Tabel 3.1  Parameter Fisik dan Properti Benda Tegar Wahana Over-Actuated 8-Pendorong</w:t>
       </w:r>
       <w:r>
         <w:rPr>
@@ -2736,7 +2712,7 @@
           <w:sz w:val="19"/>
         </w:rPr>
         <w:tab/>
-        <w:t>39</w:t>
+        <w:t>40</w:t>
       </w:r>
     </w:p>
     <w:p>
@@ -2751,7 +2727,7 @@
           <w:rFonts w:ascii="Arial" w:hAnsi="Arial"/>
           <w:sz w:val="19"/>
         </w:rPr>
-        <w:t>Tabel 3.2  Parameter Fisik dan Inersia Benda Tegar AUV BlueROV2 Heavy</w:t>
+        <w:t>Tabel 3.2  Koefisien Derivatif Massa Tambah Hidrodinamika Wahana</w:t>
       </w:r>
       <w:r>
         <w:rPr>
@@ -2774,7 +2750,7 @@
           <w:rFonts w:ascii="Arial" w:hAnsi="Arial"/>
           <w:sz w:val="19"/>
         </w:rPr>
-        <w:t>Tabel 3.3  Matriks Massa Tambah Hidrodinamika Fluida (Added Mass Matrix)</w:t>
+        <w:t>Tabel 3.3  Koefisien Redaman Hidrodinamika Linier dan Kuadratik Wahana</w:t>
       </w:r>
       <w:r>
         <w:rPr>
@@ -2797,7 +2773,7 @@
           <w:rFonts w:ascii="Arial" w:hAnsi="Arial"/>
           <w:sz w:val="19"/>
         </w:rPr>
-        <w:t>Tabel 3.4  Matriks Koefisien Redaman Kuadratik dan Linier Fluida</w:t>
+        <w:t>Tabel 3.4  Posisi Spasial dan Vektor Satuan Gaya Dorong 8-Pendorong Bervektor</w:t>
       </w:r>
       <w:r>
         <w:rPr>
@@ -2805,7 +2781,7 @@
           <w:sz w:val="19"/>
         </w:rPr>
         <w:tab/>
-        <w:t>44</w:t>
+        <w:t>45</w:t>
       </w:r>
     </w:p>
     <w:p>
@@ -2829,29 +2805,6 @@
         </w:rPr>
         <w:tab/>
         <w:t>49</w:t>
-      </w:r>
-    </w:p>
-    <w:p>
-      <w:pPr>
-        <w:tabs>
-          <w:tab w:pos="7427" w:val="right" w:leader="dot"/>
-        </w:tabs>
-        <w:spacing w:line="276" w:lineRule="auto" w:after="60"/>
-      </w:pPr>
-      <w:r>
-        <w:rPr>
-          <w:rFonts w:ascii="Arial" w:hAnsi="Arial"/>
-          <w:sz w:val="19"/>
-        </w:rPr>
-        <w:t>Tabel 3.6  Konfigurasi Parameter Variansi Derau Filter Visual dan Hidrodinamika</w:t>
-      </w:r>
-      <w:r>
-        <w:rPr>
-          <w:rFonts w:ascii="Arial" w:hAnsi="Arial"/>
-          <w:sz w:val="19"/>
-        </w:rPr>
-        <w:tab/>
-        <w:t>52</w:t>
       </w:r>
     </w:p>
     <w:p>
@@ -3025,7 +2978,7 @@
           <w:rFonts w:ascii="Arial" w:hAnsi="Arial"/>
           <w:sz w:val="19"/>
         </w:rPr>
-        <w:t>Gambar 2.4  Konfigurasi Vektor Geometris 8 Pendorong T200 pada Rangka BlueROV2 Heavy</w:t>
+        <w:t>Gambar 2.4  Konfigurasi Vektor Geometris 8 Pendorong pada Rangka Wahana Over-Actuated</w:t>
       </w:r>
       <w:r>
         <w:rPr>
@@ -3117,7 +3070,7 @@
           <w:rFonts w:ascii="Arial" w:hAnsi="Arial"/>
           <w:sz w:val="19"/>
         </w:rPr>
-        <w:t>Gambar 3.2  Arsitektur Software-In-The-Loop (SITL) Gazebo Harmonic dan ArduSub</w:t>
+        <w:t>Gambar 3.2  Rangka (Frame) dan Lambung Tekanan Kustom AUV 8-Pendorong</w:t>
       </w:r>
       <w:r>
         <w:rPr>
@@ -3140,7 +3093,76 @@
           <w:rFonts w:ascii="Arial" w:hAnsi="Arial"/>
           <w:sz w:val="19"/>
         </w:rPr>
-        <w:t>Gambar 3.3  Arsitektur Hardware-In-The-Loop (HITL) Komunikasi MAVLink Subsea-Topside</w:t>
+        <w:t>Gambar 3.3  Papan Pengendali Penerbangan (Flight Controller) Pixhawk 2.4.8</w:t>
+      </w:r>
+      <w:r>
+        <w:rPr>
+          <w:rFonts w:ascii="Arial" w:hAnsi="Arial"/>
+          <w:sz w:val="19"/>
+        </w:rPr>
+        <w:tab/>
+        <w:t>48</w:t>
+      </w:r>
+    </w:p>
+    <w:p>
+      <w:pPr>
+        <w:tabs>
+          <w:tab w:pos="7427" w:val="right" w:leader="dot"/>
+        </w:tabs>
+        <w:spacing w:line="276" w:lineRule="auto" w:after="60"/>
+      </w:pPr>
+      <w:r>
+        <w:rPr>
+          <w:rFonts w:ascii="Arial" w:hAnsi="Arial"/>
+          <w:sz w:val="19"/>
+        </w:rPr>
+        <w:t>Gambar 3.4  Komputer Pendamping (Companion Computer) Raspberry Pi 4B</w:t>
+      </w:r>
+      <w:r>
+        <w:rPr>
+          <w:rFonts w:ascii="Arial" w:hAnsi="Arial"/>
+          <w:sz w:val="19"/>
+        </w:rPr>
+        <w:tab/>
+        <w:t>49</w:t>
+      </w:r>
+    </w:p>
+    <w:p>
+      <w:pPr>
+        <w:tabs>
+          <w:tab w:pos="7427" w:val="right" w:leader="dot"/>
+        </w:tabs>
+        <w:spacing w:line="276" w:lineRule="auto" w:after="60"/>
+      </w:pPr>
+      <w:r>
+        <w:rPr>
+          <w:rFonts w:ascii="Arial" w:hAnsi="Arial"/>
+          <w:sz w:val="19"/>
+        </w:rPr>
+        <w:t>Gambar 3.5  Modul Pengendali Kecepatan Elektronik (ESC EMAX BLHeli 30A)</w:t>
+      </w:r>
+      <w:r>
+        <w:rPr>
+          <w:rFonts w:ascii="Arial" w:hAnsi="Arial"/>
+          <w:sz w:val="19"/>
+        </w:rPr>
+        <w:tab/>
+        <w:t>50</w:t>
+      </w:r>
+    </w:p>
+    <w:p>
+      <w:pPr>
+        <w:tabs>
+          <w:tab w:pos="7427" w:val="right" w:leader="dot"/>
+        </w:tabs>
+        <w:spacing w:line="276" w:lineRule="auto" w:after="60"/>
+      </w:pPr>
+      <w:r>
+        <w:rPr>
+          <w:rFonts w:ascii="Arial" w:hAnsi="Arial"/>
+          <w:sz w:val="19"/>
+        </w:rPr>
+        <w:t>Gambar 3.6  Motor Pendorong Bawah Air (BLDC Underwater Thruster)</w:t>
       </w:r>
       <w:r>
         <w:rPr>
@@ -3149,6 +3171,29 @@
         </w:rPr>
         <w:tab/>
         <w:t>51</w:t>
+      </w:r>
+    </w:p>
+    <w:p>
+      <w:pPr>
+        <w:tabs>
+          <w:tab w:pos="7427" w:val="right" w:leader="dot"/>
+        </w:tabs>
+        <w:spacing w:line="276" w:lineRule="auto" w:after="60"/>
+      </w:pPr>
+      <w:r>
+        <w:rPr>
+          <w:rFonts w:ascii="Arial" w:hAnsi="Arial"/>
+          <w:sz w:val="19"/>
+        </w:rPr>
+        <w:t>Gambar 3.7  Sumber Daya Baterai Li-Po 4S 14.8V 6000 mAh dan Pengisi Daya SKYRC IMAX B6AC V2</w:t>
+      </w:r>
+      <w:r>
+        <w:rPr>
+          <w:rFonts w:ascii="Arial" w:hAnsi="Arial"/>
+          <w:sz w:val="19"/>
+        </w:rPr>
+        <w:tab/>
+        <w:t>52</w:t>
       </w:r>
     </w:p>
     <w:p>

</xml_diff>

<commit_message>
docs(thesis): replace ASCII blocks with high-res academic diagrams (flowchart, SITL, HITL) conforming to Pedoman FT-UH
</commit_message>
<xml_diff>
--- a/Thesis/docx_export/BAGIAN_AWAL_PROPOSAL.docx
+++ b/Thesis/docx_export/BAGIAN_AWAL_PROPOSAL.docx
@@ -3070,7 +3070,7 @@
           <w:rFonts w:ascii="Arial" w:hAnsi="Arial"/>
           <w:sz w:val="19"/>
         </w:rPr>
-        <w:t>Gambar 3.2  Rangka (Frame) dan Lambung Tekanan Kustom AUV 8-Pendorong</w:t>
+        <w:t>Gambar 3.2  Arsitektur Simulasi Software-In-The-Loop (SITL) Sistem AUV</w:t>
       </w:r>
       <w:r>
         <w:rPr>
@@ -3078,7 +3078,7 @@
           <w:sz w:val="19"/>
         </w:rPr>
         <w:tab/>
-        <w:t>47</w:t>
+        <w:t>46</w:t>
       </w:r>
     </w:p>
     <w:p>
@@ -3093,7 +3093,7 @@
           <w:rFonts w:ascii="Arial" w:hAnsi="Arial"/>
           <w:sz w:val="19"/>
         </w:rPr>
-        <w:t>Gambar 3.3  Papan Pengendali Penerbangan (Flight Controller) Pixhawk 2.4.8</w:t>
+        <w:t>Gambar 3.3  Arsitektur Integrasi Hardware-In-The-Loop (HITL) Mekatronika AUV</w:t>
       </w:r>
       <w:r>
         <w:rPr>
@@ -3116,30 +3116,7 @@
           <w:rFonts w:ascii="Arial" w:hAnsi="Arial"/>
           <w:sz w:val="19"/>
         </w:rPr>
-        <w:t>Gambar 3.4  Komputer Pendamping (Companion Computer) Raspberry Pi 4B</w:t>
-      </w:r>
-      <w:r>
-        <w:rPr>
-          <w:rFonts w:ascii="Arial" w:hAnsi="Arial"/>
-          <w:sz w:val="19"/>
-        </w:rPr>
-        <w:tab/>
-        <w:t>49</w:t>
-      </w:r>
-    </w:p>
-    <w:p>
-      <w:pPr>
-        <w:tabs>
-          <w:tab w:pos="7427" w:val="right" w:leader="dot"/>
-        </w:tabs>
-        <w:spacing w:line="276" w:lineRule="auto" w:after="60"/>
-      </w:pPr>
-      <w:r>
-        <w:rPr>
-          <w:rFonts w:ascii="Arial" w:hAnsi="Arial"/>
-          <w:sz w:val="19"/>
-        </w:rPr>
-        <w:t>Gambar 3.5  Modul Pengendali Kecepatan Elektronik (ESC EMAX BLHeli 30A)</w:t>
+        <w:t>Gambar 3.4  Rangka (Frame) dan Lambung Tekanan Kustom AUV 8-Pendorong</w:t>
       </w:r>
       <w:r>
         <w:rPr>
@@ -3162,7 +3139,7 @@
           <w:rFonts w:ascii="Arial" w:hAnsi="Arial"/>
           <w:sz w:val="19"/>
         </w:rPr>
-        <w:t>Gambar 3.6  Motor Pendorong Bawah Air (BLDC Underwater Thruster)</w:t>
+        <w:t>Gambar 3.5  Papan Pengendali Penerbangan (Flight Controller) Pixhawk 2.4.8</w:t>
       </w:r>
       <w:r>
         <w:rPr>
@@ -3185,7 +3162,7 @@
           <w:rFonts w:ascii="Arial" w:hAnsi="Arial"/>
           <w:sz w:val="19"/>
         </w:rPr>
-        <w:t>Gambar 3.7  Sumber Daya Baterai Li-Po 4S 14.8V 6000 mAh dan Pengisi Daya SKYRC IMAX B6AC V2</w:t>
+        <w:t>Gambar 3.6  Komputer Pendamping (Companion Computer) Raspberry Pi 4B</w:t>
       </w:r>
       <w:r>
         <w:rPr>
@@ -3194,6 +3171,75 @@
         </w:rPr>
         <w:tab/>
         <w:t>52</w:t>
+      </w:r>
+    </w:p>
+    <w:p>
+      <w:pPr>
+        <w:tabs>
+          <w:tab w:pos="7427" w:val="right" w:leader="dot"/>
+        </w:tabs>
+        <w:spacing w:line="276" w:lineRule="auto" w:after="60"/>
+      </w:pPr>
+      <w:r>
+        <w:rPr>
+          <w:rFonts w:ascii="Arial" w:hAnsi="Arial"/>
+          <w:sz w:val="19"/>
+        </w:rPr>
+        <w:t>Gambar 3.7  Modul Pengendali Kecepatan Elektronik (ESC EMAX BLHeli 30A)</w:t>
+      </w:r>
+      <w:r>
+        <w:rPr>
+          <w:rFonts w:ascii="Arial" w:hAnsi="Arial"/>
+          <w:sz w:val="19"/>
+        </w:rPr>
+        <w:tab/>
+        <w:t>53</w:t>
+      </w:r>
+    </w:p>
+    <w:p>
+      <w:pPr>
+        <w:tabs>
+          <w:tab w:pos="7427" w:val="right" w:leader="dot"/>
+        </w:tabs>
+        <w:spacing w:line="276" w:lineRule="auto" w:after="60"/>
+      </w:pPr>
+      <w:r>
+        <w:rPr>
+          <w:rFonts w:ascii="Arial" w:hAnsi="Arial"/>
+          <w:sz w:val="19"/>
+        </w:rPr>
+        <w:t>Gambar 3.8  Motor Pendorong Bawah Air (BLDC Underwater Thruster)</w:t>
+      </w:r>
+      <w:r>
+        <w:rPr>
+          <w:rFonts w:ascii="Arial" w:hAnsi="Arial"/>
+          <w:sz w:val="19"/>
+        </w:rPr>
+        <w:tab/>
+        <w:t>54</w:t>
+      </w:r>
+    </w:p>
+    <w:p>
+      <w:pPr>
+        <w:tabs>
+          <w:tab w:pos="7427" w:val="right" w:leader="dot"/>
+        </w:tabs>
+        <w:spacing w:line="276" w:lineRule="auto" w:after="60"/>
+      </w:pPr>
+      <w:r>
+        <w:rPr>
+          <w:rFonts w:ascii="Arial" w:hAnsi="Arial"/>
+          <w:sz w:val="19"/>
+        </w:rPr>
+        <w:t>Gambar 3.9  Sumber Daya Baterai Li-Po 4S 14.8V 6000 mAh dan Pengisi Daya SKYRC IMAX B6AC V2</w:t>
+      </w:r>
+      <w:r>
+        <w:rPr>
+          <w:rFonts w:ascii="Arial" w:hAnsi="Arial"/>
+          <w:sz w:val="19"/>
+        </w:rPr>
+        <w:tab/>
+        <w:t>55</w:t>
       </w:r>
     </w:p>
     <w:p>

</xml_diff>

<commit_message>
feat(thesis): integrate physical hardware component photos and 2-pass dynamic pagination synchronization
</commit_message>
<xml_diff>
--- a/Thesis/docx_export/BAGIAN_AWAL_PROPOSAL.docx
+++ b/Thesis/docx_export/BAGIAN_AWAL_PROPOSAL.docx
@@ -2807,7 +2807,7 @@
                 <w:rFonts w:ascii="Arial" w:hAnsi="Arial"/>
                 <w:sz w:val="19"/>
               </w:rPr>
-              <w:t>5</w:t>
+              <w:t>4</w:t>
             </w:r>
           </w:p>
         </w:tc>
@@ -2883,7 +2883,7 @@
                 <w:rFonts w:ascii="Arial" w:hAnsi="Arial"/>
                 <w:sz w:val="19"/>
               </w:rPr>
-              <w:t>6</w:t>
+              <w:t>5</w:t>
             </w:r>
           </w:p>
         </w:tc>
@@ -2959,7 +2959,7 @@
                 <w:rFonts w:ascii="Arial" w:hAnsi="Arial"/>
                 <w:sz w:val="19"/>
               </w:rPr>
-              <w:t>7</w:t>
+              <w:t>6</w:t>
             </w:r>
           </w:p>
         </w:tc>
@@ -3035,7 +3035,7 @@
                 <w:rFonts w:ascii="Arial" w:hAnsi="Arial"/>
                 <w:sz w:val="19"/>
               </w:rPr>
-              <w:t>8</w:t>
+              <w:t>7</w:t>
             </w:r>
           </w:p>
         </w:tc>
@@ -3112,7 +3112,7 @@
                 <w:b/>
                 <w:sz w:val="19"/>
               </w:rPr>
-              <w:t>10</w:t>
+              <w:t>9</w:t>
             </w:r>
           </w:p>
         </w:tc>
@@ -3203,7 +3203,7 @@
                 <w:rFonts w:ascii="Arial" w:hAnsi="Arial"/>
                 <w:sz w:val="19"/>
               </w:rPr>
-              <w:t>10</w:t>
+              <w:t>9</w:t>
             </w:r>
           </w:p>
         </w:tc>
@@ -3355,7 +3355,7 @@
                 <w:rFonts w:ascii="Arial" w:hAnsi="Arial"/>
                 <w:sz w:val="19"/>
               </w:rPr>
-              <w:t>18</w:t>
+              <w:t>19</w:t>
             </w:r>
           </w:p>
         </w:tc>
@@ -3431,7 +3431,7 @@
                 <w:rFonts w:ascii="Arial" w:hAnsi="Arial"/>
                 <w:sz w:val="19"/>
               </w:rPr>
-              <w:t>24</w:t>
+              <w:t>25</w:t>
             </w:r>
           </w:p>
         </w:tc>
@@ -3613,7 +3613,7 @@
                 <w:rFonts w:ascii="Arial" w:hAnsi="Arial"/>
                 <w:sz w:val="19"/>
               </w:rPr>
-              <w:t>37</w:t>
+              <w:t>38</w:t>
             </w:r>
           </w:p>
         </w:tc>
@@ -3690,7 +3690,7 @@
                 <w:b/>
                 <w:sz w:val="19"/>
               </w:rPr>
-              <w:t>52</w:t>
+              <w:t>53</w:t>
             </w:r>
           </w:p>
         </w:tc>
@@ -3766,7 +3766,7 @@
                 <w:rFonts w:ascii="Arial" w:hAnsi="Arial"/>
                 <w:sz w:val="19"/>
               </w:rPr>
-              <w:t>52</w:t>
+              <w:t>53</w:t>
             </w:r>
           </w:p>
         </w:tc>
@@ -3918,7 +3918,7 @@
                 <w:rFonts w:ascii="Arial" w:hAnsi="Arial"/>
                 <w:sz w:val="19"/>
               </w:rPr>
-              <w:t>56</w:t>
+              <w:t>57</w:t>
             </w:r>
           </w:p>
         </w:tc>
@@ -4009,7 +4009,7 @@
                 <w:rFonts w:ascii="Arial" w:hAnsi="Arial"/>
                 <w:sz w:val="19"/>
               </w:rPr>
-              <w:t>61</w:t>
+              <w:t>64</w:t>
             </w:r>
           </w:p>
         </w:tc>
@@ -4100,7 +4100,7 @@
                 <w:rFonts w:ascii="Arial" w:hAnsi="Arial"/>
                 <w:sz w:val="19"/>
               </w:rPr>
-              <w:t>64</w:t>
+              <w:t>66</w:t>
             </w:r>
           </w:p>
         </w:tc>
@@ -4176,7 +4176,7 @@
                 <w:rFonts w:ascii="Arial" w:hAnsi="Arial"/>
                 <w:sz w:val="19"/>
               </w:rPr>
-              <w:t>71</w:t>
+              <w:t>76</w:t>
             </w:r>
           </w:p>
         </w:tc>
@@ -4253,7 +4253,7 @@
                 <w:b/>
                 <w:sz w:val="19"/>
               </w:rPr>
-              <w:t>76</w:t>
+              <w:t>80</w:t>
             </w:r>
           </w:p>
         </w:tc>
@@ -4428,7 +4428,7 @@
                 <w:rFonts w:ascii="Arial" w:hAnsi="Arial"/>
                 <w:sz w:val="19"/>
               </w:rPr>
-              <w:t>11</w:t>
+              <w:t>10</w:t>
             </w:r>
           </w:p>
         </w:tc>
@@ -4653,7 +4653,7 @@
                 <w:rFonts w:ascii="Arial" w:hAnsi="Arial"/>
                 <w:sz w:val="19"/>
               </w:rPr>
-              <w:t>57</w:t>
+              <w:t>58</w:t>
             </w:r>
           </w:p>
         </w:tc>
@@ -4728,7 +4728,7 @@
                 <w:rFonts w:ascii="Arial" w:hAnsi="Arial"/>
                 <w:sz w:val="19"/>
               </w:rPr>
-              <w:t>58</w:t>
+              <w:t>60</w:t>
             </w:r>
           </w:p>
         </w:tc>
@@ -4803,7 +4803,7 @@
                 <w:rFonts w:ascii="Arial" w:hAnsi="Arial"/>
                 <w:sz w:val="19"/>
               </w:rPr>
-              <w:t>59</w:t>
+              <w:t>61</w:t>
             </w:r>
           </w:p>
         </w:tc>
@@ -4878,7 +4878,7 @@
                 <w:rFonts w:ascii="Arial" w:hAnsi="Arial"/>
                 <w:sz w:val="19"/>
               </w:rPr>
-              <w:t>60</w:t>
+              <w:t>62</w:t>
             </w:r>
           </w:p>
         </w:tc>
@@ -4953,7 +4953,7 @@
                 <w:rFonts w:ascii="Arial" w:hAnsi="Arial"/>
                 <w:sz w:val="19"/>
               </w:rPr>
-              <w:t>64</w:t>
+              <w:t>67</w:t>
             </w:r>
           </w:p>
         </w:tc>
@@ -5128,7 +5128,7 @@
                 <w:rFonts w:ascii="Arial" w:hAnsi="Arial"/>
                 <w:sz w:val="19"/>
               </w:rPr>
-              <w:t>13</w:t>
+              <w:t>14</w:t>
             </w:r>
           </w:p>
         </w:tc>
@@ -5203,7 +5203,7 @@
                 <w:rFonts w:ascii="Arial" w:hAnsi="Arial"/>
                 <w:sz w:val="19"/>
               </w:rPr>
-              <w:t>54</w:t>
+              <w:t>55</w:t>
             </w:r>
           </w:p>
         </w:tc>
@@ -5278,7 +5278,7 @@
                 <w:rFonts w:ascii="Arial" w:hAnsi="Arial"/>
                 <w:sz w:val="19"/>
               </w:rPr>
-              <w:t>62</w:t>
+              <w:t>65</w:t>
             </w:r>
           </w:p>
         </w:tc>
@@ -5353,7 +5353,7 @@
                 <w:rFonts w:ascii="Arial" w:hAnsi="Arial"/>
                 <w:sz w:val="19"/>
               </w:rPr>
-              <w:t>64</w:t>
+              <w:t>67</w:t>
             </w:r>
           </w:p>
         </w:tc>
@@ -5428,7 +5428,7 @@
                 <w:rFonts w:ascii="Arial" w:hAnsi="Arial"/>
                 <w:sz w:val="19"/>
               </w:rPr>
-              <w:t>65</w:t>
+              <w:t>69</w:t>
             </w:r>
           </w:p>
         </w:tc>
@@ -5503,7 +5503,7 @@
                 <w:rFonts w:ascii="Arial" w:hAnsi="Arial"/>
                 <w:sz w:val="19"/>
               </w:rPr>
-              <w:t>65</w:t>
+              <w:t>69</w:t>
             </w:r>
           </w:p>
         </w:tc>
@@ -5578,7 +5578,7 @@
                 <w:rFonts w:ascii="Arial" w:hAnsi="Arial"/>
                 <w:sz w:val="19"/>
               </w:rPr>
-              <w:t>66</w:t>
+              <w:t>70</w:t>
             </w:r>
           </w:p>
         </w:tc>
@@ -5653,7 +5653,7 @@
                 <w:rFonts w:ascii="Arial" w:hAnsi="Arial"/>
                 <w:sz w:val="19"/>
               </w:rPr>
-              <w:t>66</w:t>
+              <w:t>70</w:t>
             </w:r>
           </w:p>
         </w:tc>
@@ -5728,7 +5728,7 @@
                 <w:rFonts w:ascii="Arial" w:hAnsi="Arial"/>
                 <w:sz w:val="19"/>
               </w:rPr>
-              <w:t>67</w:t>
+              <w:t>71</w:t>
             </w:r>
           </w:p>
         </w:tc>
@@ -5766,7 +5766,7 @@
                 <w:rFonts w:ascii="Arial" w:hAnsi="Arial"/>
                 <w:sz w:val="19"/>
               </w:rPr>
-              <w:t>Gambar 3.9  Sumber Daya Baterai Li-Po 4S 14.8V 6000 mAh dan Pengisi Daya SKYRC IMAX B6AC V2</w:t>
+              <w:t>Gambar 3.9  Sumber Daya Utama Baterai Li-Po 4S 14.8V 6000 mAh</w:t>
             </w:r>
             <w:r>
               <w:rPr>
@@ -5803,7 +5803,82 @@
                 <w:rFonts w:ascii="Arial" w:hAnsi="Arial"/>
                 <w:sz w:val="19"/>
               </w:rPr>
-              <w:t>67</w:t>
+              <w:t>71</w:t>
+            </w:r>
+          </w:p>
+        </w:tc>
+      </w:tr>
+      <w:tr>
+        <w:trPr>
+          <w:cantSplit/>
+        </w:trPr>
+        <w:tc>
+          <w:tcPr>
+            <w:tcW w:type="dxa" w:w="6576"/>
+            <w:tcBorders>
+              <w:top w:val="none"/>
+              <w:left w:val="none"/>
+              <w:bottom w:val="none"/>
+              <w:right w:val="none"/>
+            </w:tcBorders>
+            <w:tcMar>
+              <w:top w:w="20" w:type="dxa"/>
+              <w:bottom w:w="20" w:type="dxa"/>
+              <w:left w:w="0" w:type="dxa"/>
+              <w:right w:w="0" w:type="dxa"/>
+            </w:tcMar>
+          </w:tcPr>
+          <w:p>
+            <w:pPr>
+              <w:tabs>
+                <w:tab w:pos="6463" w:val="right" w:leader="dot"/>
+              </w:tabs>
+              <w:spacing w:line="276" w:lineRule="auto" w:after="60"/>
+              <w:jc w:val="left"/>
+            </w:pPr>
+            <w:r>
+              <w:rPr>
+                <w:rFonts w:ascii="Arial" w:hAnsi="Arial"/>
+                <w:sz w:val="19"/>
+              </w:rPr>
+              <w:t>Gambar 3.10  Modul Kamera Sistem Pelacakan Visual: Raspberry Pi Camera Rev 1.3 dan Webcam Logitech C922 Pro</w:t>
+            </w:r>
+            <w:r>
+              <w:rPr>
+                <w:rFonts w:ascii="Arial" w:hAnsi="Arial"/>
+                <w:sz w:val="19"/>
+              </w:rPr>
+              <w:tab/>
+            </w:r>
+          </w:p>
+        </w:tc>
+        <w:tc>
+          <w:tcPr>
+            <w:tcW w:type="dxa" w:w="794"/>
+            <w:tcBorders>
+              <w:top w:val="none"/>
+              <w:left w:val="none"/>
+              <w:bottom w:val="none"/>
+              <w:right w:val="none"/>
+            </w:tcBorders>
+            <w:tcMar>
+              <w:top w:w="20" w:type="dxa"/>
+              <w:bottom w:w="20" w:type="dxa"/>
+              <w:left w:w="0" w:type="dxa"/>
+              <w:right w:w="0" w:type="dxa"/>
+            </w:tcMar>
+          </w:tcPr>
+          <w:p>
+            <w:pPr>
+              <w:spacing w:line="276" w:lineRule="auto" w:after="60"/>
+              <w:jc w:val="right"/>
+            </w:pPr>
+            <w:r>
+              <w:rPr>
+                <w:rFonts w:ascii="Arial" w:hAnsi="Arial"/>
+                <w:sz w:val="19"/>
+              </w:rPr>
+              <w:t>72</w:t>
             </w:r>
           </w:p>
         </w:tc>

</xml_diff>